<commit_message>
add doi for Sieker 2026 and accepted status for StPierre 2026
</commit_message>
<xml_diff>
--- a/files/publications.docx
+++ b/files/publications.docx
@@ -95,19 +95,7 @@
         <w:rPr>
           <w:rFonts w:ascii="Liberation Serif" w:hAnsi="Liberation Serif"/>
         </w:rPr>
-        <w:t xml:space="preserve">, Lohmann, K., Matei, D., Pilch-Kedzierski, R. Improved European heat event simulation in General Circulation Models with an eddy-permitting ocean. Nature Communications Earth &amp; Environment, 7, 123. </w:t>
-      </w:r>
-      <w:r>
-        <w:rPr>
-          <w:rFonts w:ascii="Liberation Serif" w:hAnsi="Liberation Serif"/>
-        </w:rPr>
-        <w:t xml:space="preserve">DOI: </w:t>
-      </w:r>
-      <w:r>
-        <w:rPr>
-          <w:rFonts w:ascii="Liberation Serif" w:hAnsi="Liberation Serif"/>
-        </w:rPr>
-        <w:t xml:space="preserve">10.1038/s43247-025-03145-9 </w:t>
+        <w:t xml:space="preserve">, Lohmann, K., Matei, D., Pilch-Kedzierski, R. Improved European heat event simulation in General Circulation Models with an eddy-permitting ocean. Nature Communications Earth &amp; Environment, 7, 123. DOI: 10.1038/s43247-025-03145-9 </w:t>
         <w:br/>
       </w:r>
       <w:hyperlink r:id="rId2">
@@ -196,19 +184,7 @@
         <w:rPr>
           <w:rFonts w:ascii="Liberation Serif" w:hAnsi="Liberation Serif"/>
         </w:rPr>
-        <w:t xml:space="preserve"> Century. Geophysical Research Letters, 52. </w:t>
-      </w:r>
-      <w:r>
-        <w:rPr>
-          <w:rFonts w:ascii="Liberation Serif" w:hAnsi="Liberation Serif"/>
-        </w:rPr>
-        <w:t xml:space="preserve">DOI: </w:t>
-      </w:r>
-      <w:r>
-        <w:rPr>
-          <w:rFonts w:ascii="Liberation Serif" w:hAnsi="Liberation Serif"/>
-        </w:rPr>
-        <w:t>10.1029/2024GL114140</w:t>
+        <w:t xml:space="preserve"> Century. Geophysical Research Letters, 52. DOI: 10.1029/2024GL114140</w:t>
         <w:br/>
       </w:r>
       <w:hyperlink r:id="rId3">
@@ -251,21 +227,7 @@
           <w:rFonts w:ascii="Liberation Serif" w:hAnsi="Liberation Serif"/>
           <w:lang w:val="en-US"/>
         </w:rPr>
-        <w:t xml:space="preserve">, Savita, A., Park, W. (2025) Impact of horizontal resolution and model time step on European precipitation extremes in the OpenIFS atmosphere model. Geosci. Model Dev., 18, 5435–5449, </w:t>
-      </w:r>
-      <w:r>
-        <w:rPr>
-          <w:rFonts w:ascii="Liberation Serif" w:hAnsi="Liberation Serif"/>
-          <w:lang w:val="en-US"/>
-        </w:rPr>
-        <w:t xml:space="preserve">DOI: </w:t>
-      </w:r>
-      <w:r>
-        <w:rPr>
-          <w:rFonts w:ascii="Liberation Serif" w:hAnsi="Liberation Serif"/>
-          <w:lang w:val="en-US"/>
-        </w:rPr>
-        <w:t>10.5194/gmd-18-5435-2025</w:t>
+        <w:t>, Savita, A., Park, W. (2025) Impact of horizontal resolution and model time step on European precipitation extremes in the OpenIFS atmosphere model. Geosci. Model Dev., 18, 5435–5449, DOI: 10.5194/gmd-18-5435-2025</w:t>
         <w:br/>
       </w:r>
       <w:hyperlink r:id="rId4">
@@ -346,12 +308,6 @@
           <w:lang w:val="en-US"/>
         </w:rPr>
         <w:t>, doi: 10.5194/wcd-5-805-2024</w:t>
-      </w:r>
-      <w:r>
-        <w:rPr>
-          <w:rFonts w:ascii="Liberation Serif" w:hAnsi="Liberation Serif"/>
-          <w:lang w:val="en-US"/>
-        </w:rPr>
         <w:br/>
       </w:r>
       <w:hyperlink r:id="rId5">
@@ -1853,14 +1809,7 @@
           <w:rFonts w:ascii="Liberation Serif" w:hAnsi="Liberation Serif"/>
           <w:lang w:val="en-US"/>
         </w:rPr>
-        <w:t xml:space="preserve">, T. (2013), Evaluation and Tuning of Model Trajectories and Spreading Rates in the Baltic Sea using Surface Drifter Observations, in Preventive Methods for Coastal Protection, edited by T. Soomere and E. Quak, Springer International Publishing. </w:t>
-      </w:r>
-      <w:r>
-        <w:rPr>
-          <w:rFonts w:ascii="Liberation Serif" w:hAnsi="Liberation Serif"/>
-          <w:lang w:val="en-US"/>
-        </w:rPr>
-        <w:t>DOI: 10.1007/978-3-319-00440-2_8.</w:t>
+        <w:t>, T. (2013), Evaluation and Tuning of Model Trajectories and Spreading Rates in the Baltic Sea using Surface Drifter Observations, in Preventive Methods for Coastal Protection, edited by T. Soomere and E. Quak, Springer International Publishing. DOI: 10.1007/978-3-319-00440-2_8.</w:t>
       </w:r>
       <w:r>
         <w:rPr>
@@ -2152,6 +2101,7 @@
     <w:p>
       <w:pPr>
         <w:pStyle w:val="Heading2"/>
+        <w:spacing w:before="0" w:after="0"/>
         <w:rPr>
           <w:rFonts w:ascii="Liberation Serif" w:hAnsi="Liberation Serif"/>
         </w:rPr>
@@ -2186,12 +2136,6 @@
           <w:lang w:val="en-US"/>
         </w:rPr>
         <w:t xml:space="preserve"> (2014), Atmospheric &amp; Oceanic Applications of Eulerian and Lagrangian Transport Modelling, Ph.D. thesis, Stockholm University. URN: urn:nbn:se:su:diva-97348</w:t>
-      </w:r>
-      <w:r>
-        <w:rPr>
-          <w:rFonts w:ascii="Liberation Serif" w:hAnsi="Liberation Serif"/>
-          <w:lang w:val="en-US"/>
-        </w:rPr>
         <w:br/>
       </w:r>
       <w:hyperlink r:id="rId25">
@@ -2248,6 +2192,7 @@
     <w:p>
       <w:pPr>
         <w:pStyle w:val="Heading2"/>
+        <w:spacing w:before="0" w:after="0"/>
         <w:rPr>
           <w:rFonts w:ascii="Liberation Serif" w:hAnsi="Liberation Serif"/>
         </w:rPr>
@@ -2519,6 +2464,7 @@
     <w:p>
       <w:pPr>
         <w:pStyle w:val="Heading2"/>
+        <w:spacing w:before="0" w:after="0"/>
         <w:rPr>
           <w:rFonts w:ascii="Liberation Serif" w:hAnsi="Liberation Serif"/>
         </w:rPr>
@@ -2770,14 +2716,14 @@
       </w:pPr>
       <w:r>
         <w:rPr>
-          <w:rFonts w:ascii="Liberation Serif" w:hAnsi="Liberation Serif"/>
+          <w:rFonts w:eastAsia="Times Roman" w:cs="Times Roman" w:ascii="Liberation Serif" w:hAnsi="Liberation Serif"/>
           <w:lang w:val="en-US"/>
         </w:rPr>
-        <w:t xml:space="preserve">Ödalen, M., Savita, A., </w:t>
-      </w:r>
-      <w:r>
-        <w:rPr>
-          <w:rFonts w:ascii="Liberation Serif" w:hAnsi="Liberation Serif"/>
+        <w:t xml:space="preserve">Liu, Y., </w:t>
+      </w:r>
+      <w:r>
+        <w:rPr>
+          <w:rFonts w:eastAsia="Times Roman" w:cs="Times Roman" w:ascii="Liberation Serif" w:hAnsi="Liberation Serif"/>
           <w:b/>
           <w:bCs/>
           <w:lang w:val="en-US"/>
@@ -2786,10 +2732,10 @@
       </w:r>
       <w:r>
         <w:rPr>
-          <w:rFonts w:ascii="Liberation Serif" w:hAnsi="Liberation Serif"/>
+          <w:rFonts w:eastAsia="Times Roman" w:cs="Times Roman" w:ascii="Liberation Serif" w:hAnsi="Liberation Serif"/>
           <w:lang w:val="en-US"/>
         </w:rPr>
-        <w:t xml:space="preserve">, Wahl, S., Ferreira, D., Ayres, H., Roquet, F., Park, W. Coupled climate effects of eddy rich model resolution in and south of the Agulhas. In prep. </w:t>
+        <w:t xml:space="preserve">, Savita, A., Nnamchi, H., Park, W. Contrasting Impacts of Atlantic and Pacific Decadal Variability on Regional Sahel Precipitation. In prep. </w:t>
       </w:r>
     </w:p>
     <w:p>
@@ -2808,7 +2754,7 @@
           <w:rFonts w:ascii="Liberation Serif" w:hAnsi="Liberation Serif"/>
           <w:lang w:val="en-US"/>
         </w:rPr>
-        <w:t xml:space="preserve">Ojha, S., </w:t>
+        <w:t xml:space="preserve">Ödalen, M., Savita, A., </w:t>
       </w:r>
       <w:r>
         <w:rPr>
@@ -2824,7 +2770,7 @@
           <w:rFonts w:ascii="Liberation Serif" w:hAnsi="Liberation Serif"/>
           <w:lang w:val="en-US"/>
         </w:rPr>
-        <w:t xml:space="preserve">, Martin, T., Chafik, L., Maisonnave, E., Park, W., (2025) Meridional heat transport in the North Atlantic region: Effects of ocean and atmosphere grid resolutions. In prep. </w:t>
+        <w:t xml:space="preserve">, Wahl, S., Ferreira, D., Ayres, H., Roquet, F., Park, W. Coupled climate effects of eddy rich model resolution in and south of the Agulhas. In prep. </w:t>
       </w:r>
     </w:p>
     <w:p>
@@ -2843,7 +2789,7 @@
           <w:rFonts w:ascii="Liberation Serif" w:hAnsi="Liberation Serif"/>
           <w:lang w:val="en-US"/>
         </w:rPr>
-        <w:t xml:space="preserve">Savita, A., Nnamchi, H., </w:t>
+        <w:t xml:space="preserve">Ojha, S., </w:t>
       </w:r>
       <w:r>
         <w:rPr>
@@ -2859,7 +2805,7 @@
           <w:rFonts w:ascii="Liberation Serif" w:hAnsi="Liberation Serif"/>
           <w:lang w:val="en-US"/>
         </w:rPr>
-        <w:t xml:space="preserve">, Latif, M., Wahl, S. North Atlantic Sea Surface Temperature-Driven Predictability of the North Atlantic Oscillation. In prep. </w:t>
+        <w:t xml:space="preserve">, Martin, T., Chafik, L., Maisonnave, E., Park, W., (2025) Meridional heat transport in the North Atlantic region: Effects of ocean and atmosphere grid resolutions. In prep. </w:t>
       </w:r>
     </w:p>
     <w:p>
@@ -2878,7 +2824,7 @@
           <w:rFonts w:ascii="Liberation Serif" w:hAnsi="Liberation Serif"/>
           <w:lang w:val="en-US"/>
         </w:rPr>
-        <w:t xml:space="preserve">Sieker, T., </w:t>
+        <w:t xml:space="preserve">Savita, A., Nnamchi, H., </w:t>
       </w:r>
       <w:r>
         <w:rPr>
@@ -2894,7 +2840,7 @@
           <w:rFonts w:ascii="Liberation Serif" w:hAnsi="Liberation Serif"/>
           <w:lang w:val="en-US"/>
         </w:rPr>
-        <w:t xml:space="preserve">, Park, W., (2025) Coupled model bias in the North Atlantic in the FOCI-OpenIFS coupled climate model. Accepted for Climate Dynamics. </w:t>
+        <w:t xml:space="preserve">, Latif, M., Wahl, S. North Atlantic Sea Surface Temperature-Driven Predictability of the North Atlantic Oscillation. In prep. </w:t>
       </w:r>
     </w:p>
     <w:p>
@@ -2913,7 +2859,7 @@
           <w:rFonts w:ascii="Liberation Serif" w:hAnsi="Liberation Serif"/>
           <w:lang w:val="en-US"/>
         </w:rPr>
-        <w:t xml:space="preserve">StPierre, M., </w:t>
+        <w:t xml:space="preserve">Sieker, T., </w:t>
       </w:r>
       <w:r>
         <w:rPr>
@@ -2929,21 +2875,49 @@
           <w:rFonts w:ascii="Liberation Serif" w:hAnsi="Liberation Serif"/>
           <w:lang w:val="en-US"/>
         </w:rPr>
-        <w:t>, Park, W., Borchert, L.F., Latif, M., (2</w:t>
+        <w:t xml:space="preserve">, Park, W., (2025) Coupled model bias in the North Atlantic in the FOCI-OpenIFS coupled climate model. Accepted for Climate Dynamics. </w:t>
       </w:r>
       <w:r>
         <w:rPr>
           <w:rFonts w:ascii="Liberation Serif" w:hAnsi="Liberation Serif"/>
           <w:lang w:val="en-US"/>
         </w:rPr>
-        <w:t>0</w:t>
-      </w:r>
+        <w:t>doi: 10.1007/s00382-026-08110-6</w:t>
+      </w:r>
+    </w:p>
+    <w:p>
+      <w:pPr>
+        <w:pStyle w:val="Default"/>
+        <w:bidi w:val="0"/>
+        <w:spacing w:lineRule="auto" w:line="240" w:before="120" w:after="0"/>
+        <w:ind w:hanging="0" w:start="0" w:end="0"/>
+        <w:jc w:val="start"/>
+        <w:rPr>
+          <w:rFonts w:ascii="Liberation Serif" w:hAnsi="Liberation Serif"/>
+        </w:rPr>
+      </w:pPr>
       <w:r>
         <w:rPr>
           <w:rFonts w:ascii="Liberation Serif" w:hAnsi="Liberation Serif"/>
           <w:lang w:val="en-US"/>
         </w:rPr>
-        <w:t xml:space="preserve">25) Emergence time of CO2-forced European summer climate trends. In review for Scientific Reports. </w:t>
+        <w:t xml:space="preserve">StPierre, M., </w:t>
+      </w:r>
+      <w:r>
+        <w:rPr>
+          <w:rFonts w:ascii="Liberation Serif" w:hAnsi="Liberation Serif"/>
+          <w:b/>
+          <w:bCs/>
+          <w:lang w:val="en-US"/>
+        </w:rPr>
+        <w:t>Kjellsson, J.</w:t>
+      </w:r>
+      <w:r>
+        <w:rPr>
+          <w:rFonts w:ascii="Liberation Serif" w:hAnsi="Liberation Serif"/>
+          <w:lang w:val="en-US"/>
+        </w:rPr>
+        <w:t xml:space="preserve">, Park, W., Borchert, L.F., Latif, M., (2025) Emergence time of CO2-forced European summer climate trends. Accepted in Scientific Reports. </w:t>
       </w:r>
     </w:p>
     <w:p>

</xml_diff>

<commit_message>
add tims orca12 paper
</commit_message>
<xml_diff>
--- a/files/publications.docx
+++ b/files/publications.docx
@@ -75,52 +75,17 @@
         <w:spacing w:lineRule="auto" w:line="240" w:before="120" w:after="0"/>
         <w:ind w:hanging="0" w:start="720" w:end="0"/>
         <w:jc w:val="start"/>
-        <w:rPr/>
+        <w:rPr>
+          <w:rFonts w:ascii="Liberation Serif" w:hAnsi="Liberation Serif"/>
+        </w:rPr>
       </w:pPr>
       <w:r>
         <w:rPr>
           <w:rFonts w:ascii="Liberation Serif" w:hAnsi="Liberation Serif"/>
-        </w:rPr>
-        <w:t xml:space="preserve">Krüger, J., </w:t>
-      </w:r>
-      <w:r>
-        <w:rPr>
-          <w:rFonts w:ascii="Liberation Serif" w:hAnsi="Liberation Serif"/>
-          <w:b/>
-          <w:bCs/>
-        </w:rPr>
-        <w:t>Kjellsson, J.</w:t>
-      </w:r>
-      <w:r>
-        <w:rPr>
-          <w:rFonts w:ascii="Liberation Serif" w:hAnsi="Liberation Serif"/>
-        </w:rPr>
-        <w:t xml:space="preserve">, Lohmann, K., Matei, D., Pilch-Kedzierski, R. Improved European heat event simulation in General Circulation Models with an eddy-permitting ocean. Nature Communications Earth &amp; Environment, 7, 123. DOI: 10.1038/s43247-025-03145-9 </w:t>
-        <w:br/>
-      </w:r>
-      <w:hyperlink r:id="rId2">
-        <w:r>
-          <w:rPr>
-            <w:rStyle w:val="Hyperlink"/>
-            <w:rFonts w:ascii="Liberation Serif" w:hAnsi="Liberation Serif"/>
-          </w:rPr>
-          <w:t>[http link]</w:t>
-        </w:r>
-      </w:hyperlink>
-    </w:p>
-    <w:p>
-      <w:pPr>
-        <w:pStyle w:val="Default"/>
-        <w:bidi w:val="0"/>
-        <w:spacing w:lineRule="auto" w:line="240" w:before="120" w:after="0"/>
-        <w:ind w:hanging="0" w:start="0" w:end="0"/>
-        <w:jc w:val="start"/>
-        <w:rPr>
-          <w:rFonts w:ascii="Liberation Serif" w:hAnsi="Liberation Serif"/>
-          <w:b/>
-          <w:bCs/>
-        </w:rPr>
-      </w:pPr>
+          <w:lang w:val="en-US"/>
+        </w:rPr>
+        <w:t xml:space="preserve">Sieker, T., </w:t>
+      </w:r>
       <w:r>
         <w:rPr>
           <w:rFonts w:ascii="Liberation Serif" w:hAnsi="Liberation Serif"/>
@@ -128,189 +93,59 @@
           <w:bCs/>
           <w:lang w:val="en-US"/>
         </w:rPr>
-        <w:t>2025</w:t>
-      </w:r>
-    </w:p>
-    <w:p>
-      <w:pPr>
-        <w:pStyle w:val="Default"/>
-        <w:bidi w:val="0"/>
-        <w:spacing w:lineRule="auto" w:line="240" w:before="120" w:after="0"/>
-        <w:ind w:hanging="0" w:start="720" w:end="0"/>
-        <w:jc w:val="start"/>
-        <w:rPr/>
-      </w:pPr>
-      <w:r>
-        <w:rPr>
-          <w:rFonts w:ascii="Liberation Serif" w:hAnsi="Liberation Serif"/>
-        </w:rPr>
-        <w:t xml:space="preserve">Savita, A., </w:t>
-      </w:r>
-      <w:r>
-        <w:rPr>
-          <w:rFonts w:ascii="Liberation Serif" w:hAnsi="Liberation Serif"/>
-          <w:b/>
-          <w:bCs/>
-        </w:rPr>
         <w:t>Kjellsson, J.</w:t>
       </w:r>
       <w:r>
         <w:rPr>
           <w:rFonts w:ascii="Liberation Serif" w:hAnsi="Liberation Serif"/>
-        </w:rPr>
-        <w:t>, Latif, M., Nnamchi, H., Wahl, S., (2025) Causes of Eurasian Winter-Cooling During the late 20</w:t>
-      </w:r>
-      <w:r>
-        <w:rPr>
-          <w:rFonts w:ascii="Liberation Serif" w:hAnsi="Liberation Serif"/>
-          <w:vertAlign w:val="superscript"/>
-        </w:rPr>
-        <w:t>th</w:t>
-      </w:r>
-      <w:r>
-        <w:rPr>
-          <w:rFonts w:ascii="Liberation Serif" w:hAnsi="Liberation Serif"/>
-        </w:rPr>
-        <w:t xml:space="preserve"> and Early 21</w:t>
-      </w:r>
-      <w:r>
-        <w:rPr>
-          <w:rFonts w:ascii="Liberation Serif" w:hAnsi="Liberation Serif"/>
-          <w:vertAlign w:val="superscript"/>
-        </w:rPr>
-        <w:t>st</w:t>
-      </w:r>
-      <w:r>
-        <w:rPr>
-          <w:rFonts w:ascii="Liberation Serif" w:hAnsi="Liberation Serif"/>
-        </w:rPr>
-        <w:t xml:space="preserve"> Century. Geophysical Research Letters, 52. DOI: 10.1029/2024GL114140</w:t>
+          <w:lang w:val="en-US"/>
+        </w:rPr>
+        <w:t>, Park, W., (202</w:t>
+      </w:r>
+      <w:r>
+        <w:rPr>
+          <w:rFonts w:ascii="Liberation Serif" w:hAnsi="Liberation Serif"/>
+          <w:lang w:val="en-US"/>
+        </w:rPr>
+        <w:t>6</w:t>
+      </w:r>
+      <w:r>
+        <w:rPr>
+          <w:rFonts w:ascii="Liberation Serif" w:hAnsi="Liberation Serif"/>
+          <w:lang w:val="en-US"/>
+        </w:rPr>
+        <w:t xml:space="preserve">) Coupled model bias in the North Atlantic in the FOCI-OpenIFS coupled climate model. Climate Dynamics, </w:t>
+      </w:r>
+      <w:r>
+        <w:rPr>
+          <w:rFonts w:ascii="Liberation Serif" w:hAnsi="Liberation Serif"/>
+          <w:lang w:val="en-US"/>
+        </w:rPr>
+        <w:t>64, 144</w:t>
+      </w:r>
+      <w:r>
+        <w:rPr>
+          <w:rFonts w:ascii="Liberation Serif" w:hAnsi="Liberation Serif"/>
+          <w:lang w:val="en-US"/>
+        </w:rPr>
+        <w:t xml:space="preserve">. </w:t>
+      </w:r>
+      <w:r>
+        <w:rPr>
+          <w:rFonts w:ascii="Liberation Serif" w:hAnsi="Liberation Serif"/>
+          <w:lang w:val="en-US"/>
+        </w:rPr>
+        <w:t>DOI</w:t>
+      </w:r>
+      <w:r>
+        <w:rPr>
+          <w:rFonts w:ascii="Liberation Serif" w:hAnsi="Liberation Serif"/>
+          <w:lang w:val="en-US"/>
+        </w:rPr>
+        <w:t>: 10.1007/s00382-026-08110-6</w:t>
         <w:br/>
       </w:r>
-      <w:hyperlink r:id="rId3">
-        <w:r>
-          <w:rPr>
-            <w:rStyle w:val="Hyperlink"/>
-            <w:rFonts w:ascii="Liberation Serif" w:hAnsi="Liberation Serif"/>
-          </w:rPr>
-          <w:t>[http link]</w:t>
-        </w:r>
-      </w:hyperlink>
-    </w:p>
-    <w:p>
-      <w:pPr>
-        <w:pStyle w:val="Default"/>
-        <w:bidi w:val="0"/>
-        <w:spacing w:lineRule="auto" w:line="240" w:before="120" w:after="0"/>
-        <w:ind w:hanging="0" w:start="720" w:end="0"/>
-        <w:jc w:val="start"/>
-        <w:rPr/>
-      </w:pPr>
-      <w:r>
-        <w:rPr>
-          <w:rFonts w:ascii="Liberation Serif" w:hAnsi="Liberation Serif"/>
-          <w:lang w:val="en-US"/>
-        </w:rPr>
-        <w:t xml:space="preserve">Liu, Y., </w:t>
-      </w:r>
-      <w:r>
-        <w:rPr>
-          <w:rFonts w:ascii="Liberation Serif" w:hAnsi="Liberation Serif"/>
-          <w:b/>
-          <w:bCs/>
-          <w:lang w:val="en-US"/>
-        </w:rPr>
-        <w:t>Kjellsson, J.</w:t>
-      </w:r>
-      <w:r>
-        <w:rPr>
-          <w:rFonts w:ascii="Liberation Serif" w:hAnsi="Liberation Serif"/>
-          <w:lang w:val="en-US"/>
-        </w:rPr>
-        <w:t>, Savita, A., Park, W. (2025) Impact of horizontal resolution and model time step on European precipitation extremes in the OpenIFS atmosphere model. Geosci. Model Dev., 18, 5435–5449, DOI: 10.5194/gmd-18-5435-2025</w:t>
-        <w:br/>
-      </w:r>
-      <w:hyperlink r:id="rId4">
-        <w:r>
-          <w:rPr>
-            <w:rStyle w:val="Hyperlink"/>
-            <w:rFonts w:ascii="Liberation Serif" w:hAnsi="Liberation Serif"/>
-            <w:lang w:val="en-US"/>
-          </w:rPr>
-          <w:t>[http link]</w:t>
-        </w:r>
-      </w:hyperlink>
-    </w:p>
-    <w:p>
-      <w:pPr>
-        <w:pStyle w:val="Default"/>
-        <w:bidi w:val="0"/>
-        <w:spacing w:lineRule="auto" w:line="240" w:before="120" w:after="0"/>
-        <w:ind w:hanging="0" w:start="0" w:end="0"/>
-        <w:jc w:val="start"/>
-        <w:rPr>
-          <w:rFonts w:ascii="Liberation Serif" w:hAnsi="Liberation Serif"/>
-          <w:b/>
-          <w:bCs/>
-        </w:rPr>
-      </w:pPr>
-      <w:r>
-        <w:rPr>
-          <w:rFonts w:ascii="Liberation Serif" w:hAnsi="Liberation Serif"/>
-          <w:b/>
-          <w:bCs/>
-          <w:lang w:val="en-US"/>
-        </w:rPr>
-        <w:t>2024</w:t>
-      </w:r>
-    </w:p>
-    <w:p>
-      <w:pPr>
-        <w:pStyle w:val="Default"/>
-        <w:bidi w:val="0"/>
-        <w:spacing w:lineRule="auto" w:line="240" w:before="120" w:after="0"/>
-        <w:ind w:hanging="0" w:start="720" w:end="0"/>
-        <w:jc w:val="start"/>
-        <w:rPr/>
-      </w:pPr>
-      <w:r>
-        <w:rPr>
-          <w:rFonts w:ascii="Liberation Serif" w:hAnsi="Liberation Serif"/>
-          <w:lang w:val="en-US"/>
-        </w:rPr>
-        <w:t xml:space="preserve">Ayres, H., Ferreira, D., Park, W, </w:t>
-      </w:r>
-      <w:r>
-        <w:rPr>
-          <w:rFonts w:ascii="Liberation Serif" w:hAnsi="Liberation Serif"/>
-          <w:b/>
-          <w:bCs/>
-          <w:lang w:val="en-US"/>
-        </w:rPr>
-        <w:t>Kjellsson, J.</w:t>
-      </w:r>
-      <w:r>
-        <w:rPr>
-          <w:rFonts w:ascii="Liberation Serif" w:hAnsi="Liberation Serif"/>
-          <w:lang w:val="en-US"/>
-        </w:rPr>
-        <w:t>, Ödalen, M. (2024) A comparison of the atmospheric response to the Weddell Sea polynya in AGCMs of varying resolutions. Weather Clim. Dynam., 5, 805</w:t>
-      </w:r>
-      <w:r>
-        <w:rPr>
-          <w:rFonts w:ascii="Liberation Serif" w:hAnsi="Liberation Serif"/>
-        </w:rPr>
-        <w:t>–820</w:t>
-      </w:r>
-      <w:r>
-        <w:rPr>
-          <w:rFonts w:ascii="Liberation Serif" w:hAnsi="Liberation Serif"/>
-          <w:lang w:val="en-US"/>
-        </w:rPr>
-        <w:t>, doi: 10.5194/wcd-5-805-2024</w:t>
-        <w:br/>
-      </w:r>
-      <w:hyperlink r:id="rId5">
+      <w:hyperlink r:id="rId2">
         <w:r>
           <w:rPr>
             <w:rStyle w:val="Hyperlink"/>
@@ -333,10 +168,47 @@
       <w:r>
         <w:rPr>
           <w:rFonts w:ascii="Liberation Serif" w:hAnsi="Liberation Serif"/>
-          <w:lang w:val="en-US"/>
-        </w:rPr>
-        <w:t xml:space="preserve">Savita, A., </w:t>
-      </w:r>
+        </w:rPr>
+        <w:t xml:space="preserve">Krüger, J., </w:t>
+      </w:r>
+      <w:r>
+        <w:rPr>
+          <w:rFonts w:ascii="Liberation Serif" w:hAnsi="Liberation Serif"/>
+          <w:b/>
+          <w:bCs/>
+        </w:rPr>
+        <w:t>Kjellsson, J.</w:t>
+      </w:r>
+      <w:r>
+        <w:rPr>
+          <w:rFonts w:ascii="Liberation Serif" w:hAnsi="Liberation Serif"/>
+        </w:rPr>
+        <w:t xml:space="preserve">, Lohmann, K., Matei, D., Pilch-Kedzierski, R. Improved European heat event simulation in General Circulation Models with an eddy-permitting ocean. Nature Communications Earth &amp; Environment, 7, 123. DOI: 10.1038/s43247-025-03145-9 </w:t>
+        <w:br/>
+      </w:r>
+      <w:hyperlink r:id="rId3">
+        <w:r>
+          <w:rPr>
+            <w:rStyle w:val="Hyperlink"/>
+            <w:rFonts w:ascii="Liberation Serif" w:hAnsi="Liberation Serif"/>
+          </w:rPr>
+          <w:t>[http link]</w:t>
+        </w:r>
+      </w:hyperlink>
+    </w:p>
+    <w:p>
+      <w:pPr>
+        <w:pStyle w:val="Default"/>
+        <w:bidi w:val="0"/>
+        <w:spacing w:lineRule="auto" w:line="240" w:before="120" w:after="0"/>
+        <w:ind w:hanging="0" w:start="0" w:end="0"/>
+        <w:jc w:val="start"/>
+        <w:rPr>
+          <w:rFonts w:ascii="Liberation Serif" w:hAnsi="Liberation Serif"/>
+          <w:b/>
+          <w:bCs/>
+        </w:rPr>
+      </w:pPr>
       <w:r>
         <w:rPr>
           <w:rFonts w:ascii="Liberation Serif" w:hAnsi="Liberation Serif"/>
@@ -344,13 +216,229 @@
           <w:bCs/>
           <w:lang w:val="en-US"/>
         </w:rPr>
+        <w:t>2025</w:t>
+      </w:r>
+    </w:p>
+    <w:p>
+      <w:pPr>
+        <w:pStyle w:val="Default"/>
+        <w:bidi w:val="0"/>
+        <w:spacing w:lineRule="auto" w:line="240" w:before="120" w:after="0"/>
+        <w:ind w:hanging="0" w:start="720" w:end="0"/>
+        <w:jc w:val="start"/>
+        <w:rPr/>
+      </w:pPr>
+      <w:r>
+        <w:rPr>
+          <w:rFonts w:ascii="Liberation Serif" w:hAnsi="Liberation Serif"/>
+        </w:rPr>
+        <w:t xml:space="preserve">Savita, A., </w:t>
+      </w:r>
+      <w:r>
+        <w:rPr>
+          <w:rFonts w:ascii="Liberation Serif" w:hAnsi="Liberation Serif"/>
+          <w:b/>
+          <w:bCs/>
+        </w:rPr>
         <w:t>Kjellsson, J.</w:t>
       </w:r>
       <w:r>
         <w:rPr>
           <w:rFonts w:ascii="Liberation Serif" w:hAnsi="Liberation Serif"/>
+        </w:rPr>
+        <w:t>, Latif, M., Nnamchi, H., Wahl, S., (2025) Causes of Eurasian Winter-Cooling During the late 20</w:t>
+      </w:r>
+      <w:r>
+        <w:rPr>
+          <w:rFonts w:ascii="Liberation Serif" w:hAnsi="Liberation Serif"/>
+          <w:vertAlign w:val="superscript"/>
+        </w:rPr>
+        <w:t>th</w:t>
+      </w:r>
+      <w:r>
+        <w:rPr>
+          <w:rFonts w:ascii="Liberation Serif" w:hAnsi="Liberation Serif"/>
+        </w:rPr>
+        <w:t xml:space="preserve"> and Early 21</w:t>
+      </w:r>
+      <w:r>
+        <w:rPr>
+          <w:rFonts w:ascii="Liberation Serif" w:hAnsi="Liberation Serif"/>
+          <w:vertAlign w:val="superscript"/>
+        </w:rPr>
+        <w:t>st</w:t>
+      </w:r>
+      <w:r>
+        <w:rPr>
+          <w:rFonts w:ascii="Liberation Serif" w:hAnsi="Liberation Serif"/>
+        </w:rPr>
+        <w:t xml:space="preserve"> Century. Geophysical Research Letters, 52. DOI: 10.1029/2024GL114140</w:t>
+        <w:br/>
+      </w:r>
+      <w:hyperlink r:id="rId4">
+        <w:r>
+          <w:rPr>
+            <w:rStyle w:val="Hyperlink"/>
+            <w:rFonts w:ascii="Liberation Serif" w:hAnsi="Liberation Serif"/>
+          </w:rPr>
+          <w:t>[http link]</w:t>
+        </w:r>
+      </w:hyperlink>
+    </w:p>
+    <w:p>
+      <w:pPr>
+        <w:pStyle w:val="Default"/>
+        <w:bidi w:val="0"/>
+        <w:spacing w:lineRule="auto" w:line="240" w:before="120" w:after="0"/>
+        <w:ind w:hanging="0" w:start="720" w:end="0"/>
+        <w:jc w:val="start"/>
+        <w:rPr/>
+      </w:pPr>
+      <w:r>
+        <w:rPr>
+          <w:rFonts w:ascii="Liberation Serif" w:hAnsi="Liberation Serif"/>
           <w:lang w:val="en-US"/>
         </w:rPr>
+        <w:t xml:space="preserve">Liu, Y., </w:t>
+      </w:r>
+      <w:r>
+        <w:rPr>
+          <w:rFonts w:ascii="Liberation Serif" w:hAnsi="Liberation Serif"/>
+          <w:b/>
+          <w:bCs/>
+          <w:lang w:val="en-US"/>
+        </w:rPr>
+        <w:t>Kjellsson, J.</w:t>
+      </w:r>
+      <w:r>
+        <w:rPr>
+          <w:rFonts w:ascii="Liberation Serif" w:hAnsi="Liberation Serif"/>
+          <w:lang w:val="en-US"/>
+        </w:rPr>
+        <w:t>, Savita, A., Park, W. (2025) Impact of horizontal resolution and model time step on European precipitation extremes in the OpenIFS atmosphere model. Geosci. Model Dev., 18, 5435–5449, DOI: 10.5194/gmd-18-5435-2025</w:t>
+        <w:br/>
+      </w:r>
+      <w:hyperlink r:id="rId5">
+        <w:r>
+          <w:rPr>
+            <w:rStyle w:val="Hyperlink"/>
+            <w:rFonts w:ascii="Liberation Serif" w:hAnsi="Liberation Serif"/>
+            <w:lang w:val="en-US"/>
+          </w:rPr>
+          <w:t>[http link]</w:t>
+        </w:r>
+      </w:hyperlink>
+    </w:p>
+    <w:p>
+      <w:pPr>
+        <w:pStyle w:val="Default"/>
+        <w:bidi w:val="0"/>
+        <w:spacing w:lineRule="auto" w:line="240" w:before="120" w:after="0"/>
+        <w:ind w:hanging="0" w:start="0" w:end="0"/>
+        <w:jc w:val="start"/>
+        <w:rPr>
+          <w:rFonts w:ascii="Liberation Serif" w:hAnsi="Liberation Serif"/>
+          <w:b/>
+          <w:bCs/>
+        </w:rPr>
+      </w:pPr>
+      <w:r>
+        <w:rPr>
+          <w:rFonts w:ascii="Liberation Serif" w:hAnsi="Liberation Serif"/>
+          <w:b/>
+          <w:bCs/>
+          <w:lang w:val="en-US"/>
+        </w:rPr>
+        <w:t>2024</w:t>
+      </w:r>
+    </w:p>
+    <w:p>
+      <w:pPr>
+        <w:pStyle w:val="Default"/>
+        <w:bidi w:val="0"/>
+        <w:spacing w:lineRule="auto" w:line="240" w:before="120" w:after="0"/>
+        <w:ind w:hanging="0" w:start="720" w:end="0"/>
+        <w:jc w:val="start"/>
+        <w:rPr/>
+      </w:pPr>
+      <w:r>
+        <w:rPr>
+          <w:rFonts w:ascii="Liberation Serif" w:hAnsi="Liberation Serif"/>
+          <w:lang w:val="en-US"/>
+        </w:rPr>
+        <w:t xml:space="preserve">Ayres, H., Ferreira, D., Park, W, </w:t>
+      </w:r>
+      <w:r>
+        <w:rPr>
+          <w:rFonts w:ascii="Liberation Serif" w:hAnsi="Liberation Serif"/>
+          <w:b/>
+          <w:bCs/>
+          <w:lang w:val="en-US"/>
+        </w:rPr>
+        <w:t>Kjellsson, J.</w:t>
+      </w:r>
+      <w:r>
+        <w:rPr>
+          <w:rFonts w:ascii="Liberation Serif" w:hAnsi="Liberation Serif"/>
+          <w:lang w:val="en-US"/>
+        </w:rPr>
+        <w:t>, Ödalen, M. (2024) A comparison of the atmospheric response to the Weddell Sea polynya in AGCMs of varying resolutions. Weather Clim. Dynam., 5, 805</w:t>
+      </w:r>
+      <w:r>
+        <w:rPr>
+          <w:rFonts w:ascii="Liberation Serif" w:hAnsi="Liberation Serif"/>
+        </w:rPr>
+        <w:t>–820</w:t>
+      </w:r>
+      <w:r>
+        <w:rPr>
+          <w:rFonts w:ascii="Liberation Serif" w:hAnsi="Liberation Serif"/>
+          <w:lang w:val="en-US"/>
+        </w:rPr>
+        <w:t>, doi: 10.5194/wcd-5-805-2024</w:t>
+        <w:br/>
+      </w:r>
+      <w:hyperlink r:id="rId6">
+        <w:r>
+          <w:rPr>
+            <w:rStyle w:val="Hyperlink"/>
+            <w:rFonts w:ascii="Liberation Serif" w:hAnsi="Liberation Serif"/>
+            <w:lang w:val="en-US"/>
+          </w:rPr>
+          <w:t>[http link]</w:t>
+        </w:r>
+      </w:hyperlink>
+    </w:p>
+    <w:p>
+      <w:pPr>
+        <w:pStyle w:val="Default"/>
+        <w:bidi w:val="0"/>
+        <w:spacing w:lineRule="auto" w:line="240" w:before="120" w:after="0"/>
+        <w:ind w:hanging="0" w:start="720" w:end="0"/>
+        <w:jc w:val="start"/>
+        <w:rPr/>
+      </w:pPr>
+      <w:r>
+        <w:rPr>
+          <w:rFonts w:ascii="Liberation Serif" w:hAnsi="Liberation Serif"/>
+          <w:lang w:val="en-US"/>
+        </w:rPr>
+        <w:t xml:space="preserve">Savita, A., </w:t>
+      </w:r>
+      <w:r>
+        <w:rPr>
+          <w:rFonts w:ascii="Liberation Serif" w:hAnsi="Liberation Serif"/>
+          <w:b/>
+          <w:bCs/>
+          <w:lang w:val="en-US"/>
+        </w:rPr>
+        <w:t>Kjellsson, J.</w:t>
+      </w:r>
+      <w:r>
+        <w:rPr>
+          <w:rFonts w:ascii="Liberation Serif" w:hAnsi="Liberation Serif"/>
+          <w:lang w:val="en-US"/>
+        </w:rPr>
         <w:t xml:space="preserve">, Pilch-Kedzierski, R., Latif, M., Rahm, T., Wahl, S., Park, W. (2024) ECMWF-OpenIFS climate sensitivity to horizontal resolutions and model time step. Geoscientific Model Development. </w:t>
       </w:r>
       <w:r>
@@ -385,7 +473,7 @@
         </w:rPr>
         <w:br/>
       </w:r>
-      <w:hyperlink r:id="rId6">
+      <w:hyperlink r:id="rId7">
         <w:r>
           <w:rPr>
             <w:rStyle w:val="Hyperlink"/>
@@ -457,7 +545,7 @@
         </w:rPr>
         <w:br/>
       </w:r>
-      <w:hyperlink r:id="rId7">
+      <w:hyperlink r:id="rId8">
         <w:r>
           <w:rPr>
             <w:rStyle w:val="Hyperlink"/>
@@ -640,7 +728,7 @@
         </w:rPr>
         <w:br/>
       </w:r>
-      <w:hyperlink r:id="rId8">
+      <w:hyperlink r:id="rId9">
         <w:r>
           <w:rPr>
             <w:rStyle w:val="Hyperlink"/>
@@ -712,7 +800,7 @@
         </w:rPr>
         <w:br/>
       </w:r>
-      <w:hyperlink r:id="rId9">
+      <w:hyperlink r:id="rId10">
         <w:r>
           <w:rPr>
             <w:rStyle w:val="Hyperlink"/>
@@ -790,7 +878,7 @@
         </w:rPr>
         <w:br/>
       </w:r>
-      <w:hyperlink r:id="rId10">
+      <w:hyperlink r:id="rId11">
         <w:r>
           <w:rPr>
             <w:rStyle w:val="Hyperlink"/>
@@ -867,7 +955,7 @@
         </w:rPr>
         <w:br/>
       </w:r>
-      <w:hyperlink r:id="rId11">
+      <w:hyperlink r:id="rId12">
         <w:r>
           <w:rPr>
             <w:rStyle w:val="Hyperlink"/>
@@ -921,67 +1009,6 @@
         </w:rPr>
         <w:br/>
       </w:r>
-      <w:hyperlink r:id="rId12">
-        <w:r>
-          <w:rPr>
-            <w:rStyle w:val="Hyperlink"/>
-            <w:rFonts w:eastAsia="Times Roman" w:cs="Times Roman" w:ascii="Liberation Serif" w:hAnsi="Liberation Serif"/>
-          </w:rPr>
-          <w:t>[http link]</w:t>
-        </w:r>
-      </w:hyperlink>
-    </w:p>
-    <w:p>
-      <w:pPr>
-        <w:pStyle w:val="Default"/>
-        <w:bidi w:val="0"/>
-        <w:spacing w:lineRule="auto" w:line="240" w:before="120" w:after="0"/>
-        <w:ind w:hanging="0" w:start="0" w:end="0"/>
-        <w:jc w:val="start"/>
-        <w:rPr>
-          <w:rFonts w:ascii="Liberation Serif" w:hAnsi="Liberation Serif"/>
-          <w:b/>
-          <w:bCs/>
-        </w:rPr>
-      </w:pPr>
-      <w:r>
-        <w:rPr>
-          <w:rFonts w:ascii="Liberation Serif" w:hAnsi="Liberation Serif"/>
-          <w:b/>
-          <w:bCs/>
-          <w:lang w:val="en-US"/>
-        </w:rPr>
-        <w:t>2018</w:t>
-      </w:r>
-    </w:p>
-    <w:p>
-      <w:pPr>
-        <w:pStyle w:val="Default"/>
-        <w:bidi w:val="0"/>
-        <w:spacing w:lineRule="auto" w:line="240" w:before="120" w:after="0"/>
-        <w:ind w:hanging="0" w:start="720" w:end="0"/>
-        <w:jc w:val="start"/>
-        <w:rPr/>
-      </w:pPr>
-      <w:r>
-        <w:rPr>
-          <w:rFonts w:ascii="Liberation Serif" w:hAnsi="Liberation Serif"/>
-          <w:lang w:val="en-US"/>
-        </w:rPr>
-        <w:t>van Sebille, E., et al. (2018), Lagrangian ocean analysis: Fundamentals and practices, Ocean Modelling, 121, 49</w:t>
-      </w:r>
-      <w:r>
-        <w:rPr>
-          <w:rFonts w:ascii="Liberation Serif" w:hAnsi="Liberation Serif"/>
-        </w:rPr>
-        <w:t xml:space="preserve">–75, 10.1016/j.ocemod.2017.11.008. </w:t>
-      </w:r>
-      <w:r>
-        <w:rPr>
-          <w:rFonts w:eastAsia="Times Roman" w:cs="Times Roman" w:ascii="Liberation Serif" w:hAnsi="Liberation Serif"/>
-        </w:rPr>
-        <w:br/>
-      </w:r>
       <w:hyperlink r:id="rId13">
         <w:r>
           <w:rPr>
@@ -1010,8 +1037,9 @@
           <w:rFonts w:ascii="Liberation Serif" w:hAnsi="Liberation Serif"/>
           <w:b/>
           <w:bCs/>
-        </w:rPr>
-        <w:t>2017</w:t>
+          <w:lang w:val="en-US"/>
+        </w:rPr>
+        <w:t>2018</w:t>
       </w:r>
     </w:p>
     <w:p>
@@ -1026,6 +1054,66 @@
       <w:r>
         <w:rPr>
           <w:rFonts w:ascii="Liberation Serif" w:hAnsi="Liberation Serif"/>
+          <w:lang w:val="en-US"/>
+        </w:rPr>
+        <w:t>van Sebille, E., et al. (2018), Lagrangian ocean analysis: Fundamentals and practices, Ocean Modelling, 121, 49</w:t>
+      </w:r>
+      <w:r>
+        <w:rPr>
+          <w:rFonts w:ascii="Liberation Serif" w:hAnsi="Liberation Serif"/>
+        </w:rPr>
+        <w:t xml:space="preserve">–75, 10.1016/j.ocemod.2017.11.008. </w:t>
+      </w:r>
+      <w:r>
+        <w:rPr>
+          <w:rFonts w:eastAsia="Times Roman" w:cs="Times Roman" w:ascii="Liberation Serif" w:hAnsi="Liberation Serif"/>
+        </w:rPr>
+        <w:br/>
+      </w:r>
+      <w:hyperlink r:id="rId14">
+        <w:r>
+          <w:rPr>
+            <w:rStyle w:val="Hyperlink"/>
+            <w:rFonts w:eastAsia="Times Roman" w:cs="Times Roman" w:ascii="Liberation Serif" w:hAnsi="Liberation Serif"/>
+          </w:rPr>
+          <w:t>[http link]</w:t>
+        </w:r>
+      </w:hyperlink>
+    </w:p>
+    <w:p>
+      <w:pPr>
+        <w:pStyle w:val="Default"/>
+        <w:bidi w:val="0"/>
+        <w:spacing w:lineRule="auto" w:line="240" w:before="120" w:after="0"/>
+        <w:ind w:hanging="0" w:start="0" w:end="0"/>
+        <w:jc w:val="start"/>
+        <w:rPr>
+          <w:rFonts w:ascii="Liberation Serif" w:hAnsi="Liberation Serif"/>
+          <w:b/>
+          <w:bCs/>
+        </w:rPr>
+      </w:pPr>
+      <w:r>
+        <w:rPr>
+          <w:rFonts w:ascii="Liberation Serif" w:hAnsi="Liberation Serif"/>
+          <w:b/>
+          <w:bCs/>
+        </w:rPr>
+        <w:t>2017</w:t>
+      </w:r>
+    </w:p>
+    <w:p>
+      <w:pPr>
+        <w:pStyle w:val="Default"/>
+        <w:bidi w:val="0"/>
+        <w:spacing w:lineRule="auto" w:line="240" w:before="120" w:after="0"/>
+        <w:ind w:hanging="0" w:start="720" w:end="0"/>
+        <w:jc w:val="start"/>
+        <w:rPr/>
+      </w:pPr>
+      <w:r>
+        <w:rPr>
+          <w:rFonts w:ascii="Liberation Serif" w:hAnsi="Liberation Serif"/>
         </w:rPr>
         <w:t>D</w:t>
       </w:r>
@@ -1133,7 +1221,7 @@
         </w:rPr>
         <w:br/>
       </w:r>
-      <w:hyperlink r:id="rId14">
+      <w:hyperlink r:id="rId15">
         <w:r>
           <w:rPr>
             <w:rStyle w:val="Hyperlink"/>
@@ -1181,7 +1269,7 @@
         </w:rPr>
         <w:br/>
       </w:r>
-      <w:hyperlink r:id="rId15">
+      <w:hyperlink r:id="rId16">
         <w:r>
           <w:rPr>
             <w:rStyle w:val="Hyperlink"/>
@@ -1276,7 +1364,7 @@
         </w:rPr>
         <w:br/>
       </w:r>
-      <w:hyperlink r:id="rId16">
+      <w:hyperlink r:id="rId17">
         <w:r>
           <w:rPr>
             <w:rStyle w:val="Hyperlink"/>
@@ -1431,7 +1519,7 @@
         </w:rPr>
         <w:br/>
       </w:r>
-      <w:hyperlink r:id="rId17">
+      <w:hyperlink r:id="rId18">
         <w:r>
           <w:rPr>
             <w:rStyle w:val="Hyperlink"/>
@@ -1565,7 +1653,7 @@
         </w:rPr>
         <w:br/>
       </w:r>
-      <w:hyperlink r:id="rId18">
+      <w:hyperlink r:id="rId19">
         <w:r>
           <w:rPr>
             <w:rStyle w:val="Hyperlink"/>
@@ -1612,7 +1700,7 @@
         </w:rPr>
         <w:br/>
       </w:r>
-      <w:hyperlink r:id="rId19">
+      <w:hyperlink r:id="rId20">
         <w:r>
           <w:rPr>
             <w:rStyle w:val="Hyperlink"/>
@@ -1722,7 +1810,7 @@
         <w:t xml:space="preserve">–928. </w:t>
         <w:br/>
       </w:r>
-      <w:hyperlink r:id="rId20">
+      <w:hyperlink r:id="rId21">
         <w:r>
           <w:rPr>
             <w:rStyle w:val="Hyperlink"/>
@@ -1818,7 +1906,7 @@
         </w:rPr>
         <w:br/>
       </w:r>
-      <w:hyperlink r:id="rId21">
+      <w:hyperlink r:id="rId22">
         <w:r>
           <w:rPr>
             <w:rStyle w:val="Hyperlink"/>
@@ -1914,7 +2002,7 @@
         </w:rPr>
         <w:br/>
       </w:r>
-      <w:hyperlink r:id="rId22">
+      <w:hyperlink r:id="rId23">
         <w:r>
           <w:rPr>
             <w:rStyle w:val="Hyperlink"/>
@@ -1998,7 +2086,7 @@
         </w:rPr>
         <w:br/>
       </w:r>
-      <w:hyperlink r:id="rId23">
+      <w:hyperlink r:id="rId24">
         <w:r>
           <w:rPr>
             <w:rStyle w:val="Hyperlink"/>
@@ -2051,7 +2139,7 @@
         </w:rPr>
         <w:br/>
       </w:r>
-      <w:hyperlink r:id="rId24">
+      <w:hyperlink r:id="rId25">
         <w:r>
           <w:rPr>
             <w:rStyle w:val="Hyperlink"/>
@@ -2138,7 +2226,7 @@
         <w:t xml:space="preserve"> (2014), Atmospheric &amp; Oceanic Applications of Eulerian and Lagrangian Transport Modelling, Ph.D. thesis, Stockholm University. URN: urn:nbn:se:su:diva-97348</w:t>
         <w:br/>
       </w:r>
-      <w:hyperlink r:id="rId25">
+      <w:hyperlink r:id="rId26">
         <w:r>
           <w:rPr>
             <w:rStyle w:val="Hyperlink"/>
@@ -2175,7 +2263,7 @@
         <w:t xml:space="preserve"> (2009), Lagrangian Decomposition of the Hadley Cells, Master thesis, Stockholm University. URN: urn:nbn:se:su:diva-8732</w:t>
         <w:br/>
       </w:r>
-      <w:hyperlink r:id="rId26">
+      <w:hyperlink r:id="rId27">
         <w:r>
           <w:rPr>
             <w:rStyle w:val="Hyperlink"/>
@@ -2232,55 +2320,6 @@
           <w:rFonts w:ascii="Liberation Serif" w:hAnsi="Liberation Serif"/>
         </w:rPr>
         <w:t xml:space="preserve"> (2021) OASIS Dedicated Support, 5th annual summer, Technical Report, TR/CMGC/21/150, CECI, UMR CERFACS/CNRS No 5318, France</w:t>
-        <w:br/>
-      </w:r>
-      <w:hyperlink r:id="rId27">
-        <w:r>
-          <w:rPr>
-            <w:rStyle w:val="Hyperlink"/>
-            <w:rFonts w:ascii="Liberation Serif" w:hAnsi="Liberation Serif"/>
-          </w:rPr>
-          <w:t>[http link]</w:t>
-        </w:r>
-      </w:hyperlink>
-    </w:p>
-    <w:p>
-      <w:pPr>
-        <w:pStyle w:val="Default"/>
-        <w:bidi w:val="0"/>
-        <w:spacing w:lineRule="auto" w:line="240" w:before="120" w:after="0"/>
-        <w:ind w:hanging="0" w:start="0" w:end="0"/>
-        <w:jc w:val="start"/>
-        <w:rPr/>
-      </w:pPr>
-      <w:r>
-        <w:rPr>
-          <w:rFonts w:ascii="Liberation Serif" w:hAnsi="Liberation Serif"/>
-          <w:lang w:val="en-US"/>
-        </w:rPr>
-        <w:t xml:space="preserve">Groeskamp, S., </w:t>
-      </w:r>
-      <w:r>
-        <w:rPr>
-          <w:rFonts w:ascii="Liberation Serif" w:hAnsi="Liberation Serif"/>
-          <w:b/>
-          <w:bCs/>
-          <w:lang w:val="en-US"/>
-        </w:rPr>
-        <w:t>Kjellsson, J.</w:t>
-      </w:r>
-      <w:r>
-        <w:rPr>
-          <w:rFonts w:ascii="Liberation Serif" w:hAnsi="Liberation Serif"/>
-          <w:lang w:val="en-US"/>
-        </w:rPr>
-        <w:t xml:space="preserve"> (2021) NEED Northern European Enclosure Dam, Europhysics News, 52 (2), doi: </w:t>
-      </w:r>
-      <w:r>
-        <w:rPr>
-          <w:rFonts w:ascii="Liberation Serif" w:hAnsi="Liberation Serif"/>
-        </w:rPr>
-        <w:t>10.1051/epn/2021201</w:t>
         <w:br/>
       </w:r>
       <w:hyperlink r:id="rId28">
@@ -2305,6 +2344,13 @@
       <w:r>
         <w:rPr>
           <w:rFonts w:ascii="Liberation Serif" w:hAnsi="Liberation Serif"/>
+          <w:lang w:val="en-US"/>
+        </w:rPr>
+        <w:t xml:space="preserve">Groeskamp, S., </w:t>
+      </w:r>
+      <w:r>
+        <w:rPr>
+          <w:rFonts w:ascii="Liberation Serif" w:hAnsi="Liberation Serif"/>
           <w:b/>
           <w:bCs/>
           <w:lang w:val="en-US"/>
@@ -2316,6 +2362,48 @@
           <w:rFonts w:ascii="Liberation Serif" w:hAnsi="Liberation Serif"/>
           <w:lang w:val="en-US"/>
         </w:rPr>
+        <w:t xml:space="preserve"> (2021) NEED Northern European Enclosure Dam, Europhysics News, 52 (2), doi: </w:t>
+      </w:r>
+      <w:r>
+        <w:rPr>
+          <w:rFonts w:ascii="Liberation Serif" w:hAnsi="Liberation Serif"/>
+        </w:rPr>
+        <w:t>10.1051/epn/2021201</w:t>
+        <w:br/>
+      </w:r>
+      <w:hyperlink r:id="rId29">
+        <w:r>
+          <w:rPr>
+            <w:rStyle w:val="Hyperlink"/>
+            <w:rFonts w:ascii="Liberation Serif" w:hAnsi="Liberation Serif"/>
+          </w:rPr>
+          <w:t>[http link]</w:t>
+        </w:r>
+      </w:hyperlink>
+    </w:p>
+    <w:p>
+      <w:pPr>
+        <w:pStyle w:val="Default"/>
+        <w:bidi w:val="0"/>
+        <w:spacing w:lineRule="auto" w:line="240" w:before="120" w:after="0"/>
+        <w:ind w:hanging="0" w:start="0" w:end="0"/>
+        <w:jc w:val="start"/>
+        <w:rPr/>
+      </w:pPr>
+      <w:r>
+        <w:rPr>
+          <w:rFonts w:ascii="Liberation Serif" w:hAnsi="Liberation Serif"/>
+          <w:b/>
+          <w:bCs/>
+          <w:lang w:val="en-US"/>
+        </w:rPr>
+        <w:t>Kjellsson, J.</w:t>
+      </w:r>
+      <w:r>
+        <w:rPr>
+          <w:rFonts w:ascii="Liberation Serif" w:hAnsi="Liberation Serif"/>
+          <w:lang w:val="en-US"/>
+        </w:rPr>
         <w:t xml:space="preserve">, Streffing, J., Carver, G., Koehler, M. (2020), From weather forecasting to climate modelling using OpenIFS, ECMWF Newsletter, 164, doi: </w:t>
       </w:r>
       <w:r>
@@ -2330,7 +2418,7 @@
         </w:rPr>
         <w:br/>
       </w:r>
-      <w:hyperlink r:id="rId29">
+      <w:hyperlink r:id="rId30">
         <w:r>
           <w:rPr>
             <w:rStyle w:val="Hyperlink"/>
@@ -2428,7 +2516,7 @@
         </w:rPr>
         <w:br/>
       </w:r>
-      <w:hyperlink r:id="rId30">
+      <w:hyperlink r:id="rId31">
         <w:r>
           <w:rPr>
             <w:rStyle w:val="Hyperlink"/>
@@ -2859,48 +2947,6 @@
           <w:rFonts w:ascii="Liberation Serif" w:hAnsi="Liberation Serif"/>
           <w:lang w:val="en-US"/>
         </w:rPr>
-        <w:t xml:space="preserve">Sieker, T., </w:t>
-      </w:r>
-      <w:r>
-        <w:rPr>
-          <w:rFonts w:ascii="Liberation Serif" w:hAnsi="Liberation Serif"/>
-          <w:b/>
-          <w:bCs/>
-          <w:lang w:val="en-US"/>
-        </w:rPr>
-        <w:t>Kjellsson, J.</w:t>
-      </w:r>
-      <w:r>
-        <w:rPr>
-          <w:rFonts w:ascii="Liberation Serif" w:hAnsi="Liberation Serif"/>
-          <w:lang w:val="en-US"/>
-        </w:rPr>
-        <w:t xml:space="preserve">, Park, W., (2025) Coupled model bias in the North Atlantic in the FOCI-OpenIFS coupled climate model. Accepted for Climate Dynamics. </w:t>
-      </w:r>
-      <w:r>
-        <w:rPr>
-          <w:rFonts w:ascii="Liberation Serif" w:hAnsi="Liberation Serif"/>
-          <w:lang w:val="en-US"/>
-        </w:rPr>
-        <w:t>doi: 10.1007/s00382-026-08110-6</w:t>
-      </w:r>
-    </w:p>
-    <w:p>
-      <w:pPr>
-        <w:pStyle w:val="Default"/>
-        <w:bidi w:val="0"/>
-        <w:spacing w:lineRule="auto" w:line="240" w:before="120" w:after="0"/>
-        <w:ind w:hanging="0" w:start="0" w:end="0"/>
-        <w:jc w:val="start"/>
-        <w:rPr>
-          <w:rFonts w:ascii="Liberation Serif" w:hAnsi="Liberation Serif"/>
-        </w:rPr>
-      </w:pPr>
-      <w:r>
-        <w:rPr>
-          <w:rFonts w:ascii="Liberation Serif" w:hAnsi="Liberation Serif"/>
-          <w:lang w:val="en-US"/>
-        </w:rPr>
         <w:t xml:space="preserve">StPierre, M., </w:t>
       </w:r>
       <w:r>
@@ -2960,7 +3006,7 @@
         </w:rPr>
         <w:br/>
       </w:r>
-      <w:hyperlink r:id="rId31">
+      <w:hyperlink r:id="rId32">
         <w:r>
           <w:rPr>
             <w:rStyle w:val="Hyperlink"/>
@@ -2972,12 +3018,12 @@
       </w:hyperlink>
     </w:p>
     <w:sectPr>
-      <w:headerReference w:type="even" r:id="rId32"/>
-      <w:headerReference w:type="default" r:id="rId33"/>
-      <w:headerReference w:type="first" r:id="rId34"/>
-      <w:footerReference w:type="even" r:id="rId35"/>
-      <w:footerReference w:type="default" r:id="rId36"/>
-      <w:footerReference w:type="first" r:id="rId37"/>
+      <w:headerReference w:type="even" r:id="rId33"/>
+      <w:headerReference w:type="default" r:id="rId34"/>
+      <w:headerReference w:type="first" r:id="rId35"/>
+      <w:footerReference w:type="even" r:id="rId36"/>
+      <w:footerReference w:type="default" r:id="rId37"/>
+      <w:footerReference w:type="first" r:id="rId38"/>
       <w:type w:val="nextPage"/>
       <w:pgSz w:w="11906" w:h="16838"/>
       <w:pgMar w:left="1134" w:right="1134" w:gutter="0" w:header="709" w:top="1134" w:footer="850" w:bottom="1134"/>
@@ -3756,8 +3802,8 @@
       <w:szCs w:val="20"/>
     </w:rPr>
   </w:style>
-  <w:style w:type="character" w:styleId="FootnoteCharacters">
-    <w:name w:val="Footnote Characters"/>
+  <w:style w:type="character" w:styleId="FootnoteCharactersuser">
+    <w:name w:val="Footnote Characters (user)"/>
     <w:basedOn w:val="DefaultParagraphFont"/>
     <w:uiPriority w:val="99"/>
     <w:semiHidden/>
@@ -3767,8 +3813,8 @@
       <w:vertAlign w:val="superscript"/>
     </w:rPr>
   </w:style>
-  <w:style w:type="character" w:styleId="FootnoteCharactersuser">
-    <w:name w:val="Footnote Characters (user)"/>
+  <w:style w:type="character" w:styleId="FootnoteCharacters">
+    <w:name w:val="Footnote Characters"/>
     <w:qFormat/>
     <w:rPr>
       <w:vertAlign w:val="superscript"/>
@@ -3792,8 +3838,8 @@
       <w:szCs w:val="20"/>
     </w:rPr>
   </w:style>
-  <w:style w:type="character" w:styleId="EndnoteCharacters">
-    <w:name w:val="Endnote Characters"/>
+  <w:style w:type="character" w:styleId="EndnoteCharactersuser">
+    <w:name w:val="Endnote Characters (user)"/>
     <w:basedOn w:val="DefaultParagraphFont"/>
     <w:uiPriority w:val="99"/>
     <w:semiHidden/>
@@ -3803,8 +3849,8 @@
       <w:vertAlign w:val="superscript"/>
     </w:rPr>
   </w:style>
-  <w:style w:type="character" w:styleId="EndnoteCharactersuser">
-    <w:name w:val="Endnote Characters (user)"/>
+  <w:style w:type="character" w:styleId="EndnoteCharacters">
+    <w:name w:val="Endnote Characters"/>
     <w:qFormat/>
     <w:rPr>
       <w:vertAlign w:val="superscript"/>

</xml_diff>

<commit_message>
add mederics published paper
</commit_message>
<xml_diff>
--- a/files/publications.docx
+++ b/files/publications.docx
@@ -75,6 +75,63 @@
         <w:spacing w:lineRule="auto" w:line="240" w:before="120" w:after="0"/>
         <w:ind w:hanging="0" w:start="720" w:end="0"/>
         <w:jc w:val="start"/>
+        <w:rPr/>
+      </w:pPr>
+      <w:r>
+        <w:rPr>
+          <w:rFonts w:ascii="Liberation Serif" w:hAnsi="Liberation Serif"/>
+        </w:rPr>
+        <w:t xml:space="preserve">StPierre, M., </w:t>
+      </w:r>
+      <w:r>
+        <w:rPr>
+          <w:rFonts w:ascii="Liberation Serif" w:hAnsi="Liberation Serif"/>
+          <w:b/>
+          <w:bCs/>
+        </w:rPr>
+        <w:t>Kjellsson, J.</w:t>
+      </w:r>
+      <w:r>
+        <w:rPr>
+          <w:rFonts w:ascii="Liberation Serif" w:hAnsi="Liberation Serif"/>
+        </w:rPr>
+        <w:t xml:space="preserve">, Park, W., Borchert, L.F., Latif, M., (2025) Emergence time of CO2-forced European summer climate trends. Scientific Reports, </w:t>
+      </w:r>
+      <w:r>
+        <w:rPr>
+          <w:rFonts w:ascii="Liberation Serif" w:hAnsi="Liberation Serif"/>
+        </w:rPr>
+        <w:t>16, 9707. DOI: 10.1038/s41598-026-44761-5</w:t>
+      </w:r>
+      <w:r>
+        <w:rPr>
+          <w:rFonts w:ascii="Liberation Serif" w:hAnsi="Liberation Serif"/>
+        </w:rPr>
+        <w:br/>
+      </w:r>
+      <w:hyperlink r:id="rId2">
+        <w:r>
+          <w:rPr>
+            <w:rStyle w:val="Hyperlink"/>
+            <w:rFonts w:ascii="Liberation Serif" w:hAnsi="Liberation Serif"/>
+          </w:rPr>
+          <w:t>[http link]</w:t>
+        </w:r>
+      </w:hyperlink>
+      <w:r>
+        <w:rPr>
+          <w:rFonts w:ascii="Liberation Serif" w:hAnsi="Liberation Serif"/>
+        </w:rPr>
+        <w:t xml:space="preserve"> </w:t>
+      </w:r>
+    </w:p>
+    <w:p>
+      <w:pPr>
+        <w:pStyle w:val="Default"/>
+        <w:bidi w:val="0"/>
+        <w:spacing w:lineRule="auto" w:line="240" w:before="120" w:after="0"/>
+        <w:ind w:hanging="0" w:start="720" w:end="0"/>
+        <w:jc w:val="start"/>
         <w:rPr>
           <w:rFonts w:ascii="Liberation Serif" w:hAnsi="Liberation Serif"/>
         </w:rPr>
@@ -100,52 +157,10 @@
           <w:rFonts w:ascii="Liberation Serif" w:hAnsi="Liberation Serif"/>
           <w:lang w:val="en-US"/>
         </w:rPr>
-        <w:t>, Park, W., (202</w:t>
-      </w:r>
-      <w:r>
-        <w:rPr>
-          <w:rFonts w:ascii="Liberation Serif" w:hAnsi="Liberation Serif"/>
-          <w:lang w:val="en-US"/>
-        </w:rPr>
-        <w:t>6</w:t>
-      </w:r>
-      <w:r>
-        <w:rPr>
-          <w:rFonts w:ascii="Liberation Serif" w:hAnsi="Liberation Serif"/>
-          <w:lang w:val="en-US"/>
-        </w:rPr>
-        <w:t xml:space="preserve">) Coupled model bias in the North Atlantic in the FOCI-OpenIFS coupled climate model. Climate Dynamics, </w:t>
-      </w:r>
-      <w:r>
-        <w:rPr>
-          <w:rFonts w:ascii="Liberation Serif" w:hAnsi="Liberation Serif"/>
-          <w:lang w:val="en-US"/>
-        </w:rPr>
-        <w:t>64, 144</w:t>
-      </w:r>
-      <w:r>
-        <w:rPr>
-          <w:rFonts w:ascii="Liberation Serif" w:hAnsi="Liberation Serif"/>
-          <w:lang w:val="en-US"/>
-        </w:rPr>
-        <w:t xml:space="preserve">. </w:t>
-      </w:r>
-      <w:r>
-        <w:rPr>
-          <w:rFonts w:ascii="Liberation Serif" w:hAnsi="Liberation Serif"/>
-          <w:lang w:val="en-US"/>
-        </w:rPr>
-        <w:t>DOI</w:t>
-      </w:r>
-      <w:r>
-        <w:rPr>
-          <w:rFonts w:ascii="Liberation Serif" w:hAnsi="Liberation Serif"/>
-          <w:lang w:val="en-US"/>
-        </w:rPr>
-        <w:t>: 10.1007/s00382-026-08110-6</w:t>
+        <w:t>, Park, W., (2026) Coupled model bias in the North Atlantic in the FOCI-OpenIFS coupled climate model. Climate Dynamics, 64, 144. DOI: 10.1007/s00382-026-08110-6</w:t>
         <w:br/>
       </w:r>
-      <w:hyperlink r:id="rId2">
+      <w:hyperlink r:id="rId3">
         <w:r>
           <w:rPr>
             <w:rStyle w:val="Hyperlink"/>
@@ -186,7 +201,7 @@
         <w:t xml:space="preserve">, Lohmann, K., Matei, D., Pilch-Kedzierski, R. Improved European heat event simulation in General Circulation Models with an eddy-permitting ocean. Nature Communications Earth &amp; Environment, 7, 123. DOI: 10.1038/s43247-025-03145-9 </w:t>
         <w:br/>
       </w:r>
-      <w:hyperlink r:id="rId3">
+      <w:hyperlink r:id="rId4">
         <w:r>
           <w:rPr>
             <w:rStyle w:val="Hyperlink"/>
@@ -275,7 +290,7 @@
         <w:t xml:space="preserve"> Century. Geophysical Research Letters, 52. DOI: 10.1029/2024GL114140</w:t>
         <w:br/>
       </w:r>
-      <w:hyperlink r:id="rId4">
+      <w:hyperlink r:id="rId5">
         <w:r>
           <w:rPr>
             <w:rStyle w:val="Hyperlink"/>
@@ -318,7 +333,7 @@
         <w:t>, Savita, A., Park, W. (2025) Impact of horizontal resolution and model time step on European precipitation extremes in the OpenIFS atmosphere model. Geosci. Model Dev., 18, 5435–5449, DOI: 10.5194/gmd-18-5435-2025</w:t>
         <w:br/>
       </w:r>
-      <w:hyperlink r:id="rId5">
+      <w:hyperlink r:id="rId6">
         <w:r>
           <w:rPr>
             <w:rStyle w:val="Hyperlink"/>
@@ -398,7 +413,7 @@
         <w:t>, doi: 10.5194/wcd-5-805-2024</w:t>
         <w:br/>
       </w:r>
-      <w:hyperlink r:id="rId6">
+      <w:hyperlink r:id="rId7">
         <w:r>
           <w:rPr>
             <w:rStyle w:val="Hyperlink"/>
@@ -473,7 +488,7 @@
         </w:rPr>
         <w:br/>
       </w:r>
-      <w:hyperlink r:id="rId7">
+      <w:hyperlink r:id="rId8">
         <w:r>
           <w:rPr>
             <w:rStyle w:val="Hyperlink"/>
@@ -545,7 +560,7 @@
         </w:rPr>
         <w:br/>
       </w:r>
-      <w:hyperlink r:id="rId8">
+      <w:hyperlink r:id="rId9">
         <w:r>
           <w:rPr>
             <w:rStyle w:val="Hyperlink"/>
@@ -728,7 +743,7 @@
         </w:rPr>
         <w:br/>
       </w:r>
-      <w:hyperlink r:id="rId9">
+      <w:hyperlink r:id="rId10">
         <w:r>
           <w:rPr>
             <w:rStyle w:val="Hyperlink"/>
@@ -800,7 +815,7 @@
         </w:rPr>
         <w:br/>
       </w:r>
-      <w:hyperlink r:id="rId10">
+      <w:hyperlink r:id="rId11">
         <w:r>
           <w:rPr>
             <w:rStyle w:val="Hyperlink"/>
@@ -878,7 +893,7 @@
         </w:rPr>
         <w:br/>
       </w:r>
-      <w:hyperlink r:id="rId11">
+      <w:hyperlink r:id="rId12">
         <w:r>
           <w:rPr>
             <w:rStyle w:val="Hyperlink"/>
@@ -955,7 +970,7 @@
         </w:rPr>
         <w:br/>
       </w:r>
-      <w:hyperlink r:id="rId12">
+      <w:hyperlink r:id="rId13">
         <w:r>
           <w:rPr>
             <w:rStyle w:val="Hyperlink"/>
@@ -1009,67 +1024,6 @@
         </w:rPr>
         <w:br/>
       </w:r>
-      <w:hyperlink r:id="rId13">
-        <w:r>
-          <w:rPr>
-            <w:rStyle w:val="Hyperlink"/>
-            <w:rFonts w:eastAsia="Times Roman" w:cs="Times Roman" w:ascii="Liberation Serif" w:hAnsi="Liberation Serif"/>
-          </w:rPr>
-          <w:t>[http link]</w:t>
-        </w:r>
-      </w:hyperlink>
-    </w:p>
-    <w:p>
-      <w:pPr>
-        <w:pStyle w:val="Default"/>
-        <w:bidi w:val="0"/>
-        <w:spacing w:lineRule="auto" w:line="240" w:before="120" w:after="0"/>
-        <w:ind w:hanging="0" w:start="0" w:end="0"/>
-        <w:jc w:val="start"/>
-        <w:rPr>
-          <w:rFonts w:ascii="Liberation Serif" w:hAnsi="Liberation Serif"/>
-          <w:b/>
-          <w:bCs/>
-        </w:rPr>
-      </w:pPr>
-      <w:r>
-        <w:rPr>
-          <w:rFonts w:ascii="Liberation Serif" w:hAnsi="Liberation Serif"/>
-          <w:b/>
-          <w:bCs/>
-          <w:lang w:val="en-US"/>
-        </w:rPr>
-        <w:t>2018</w:t>
-      </w:r>
-    </w:p>
-    <w:p>
-      <w:pPr>
-        <w:pStyle w:val="Default"/>
-        <w:bidi w:val="0"/>
-        <w:spacing w:lineRule="auto" w:line="240" w:before="120" w:after="0"/>
-        <w:ind w:hanging="0" w:start="720" w:end="0"/>
-        <w:jc w:val="start"/>
-        <w:rPr/>
-      </w:pPr>
-      <w:r>
-        <w:rPr>
-          <w:rFonts w:ascii="Liberation Serif" w:hAnsi="Liberation Serif"/>
-          <w:lang w:val="en-US"/>
-        </w:rPr>
-        <w:t>van Sebille, E., et al. (2018), Lagrangian ocean analysis: Fundamentals and practices, Ocean Modelling, 121, 49</w:t>
-      </w:r>
-      <w:r>
-        <w:rPr>
-          <w:rFonts w:ascii="Liberation Serif" w:hAnsi="Liberation Serif"/>
-        </w:rPr>
-        <w:t xml:space="preserve">–75, 10.1016/j.ocemod.2017.11.008. </w:t>
-      </w:r>
-      <w:r>
-        <w:rPr>
-          <w:rFonts w:eastAsia="Times Roman" w:cs="Times Roman" w:ascii="Liberation Serif" w:hAnsi="Liberation Serif"/>
-        </w:rPr>
-        <w:br/>
-      </w:r>
       <w:hyperlink r:id="rId14">
         <w:r>
           <w:rPr>
@@ -1098,8 +1052,9 @@
           <w:rFonts w:ascii="Liberation Serif" w:hAnsi="Liberation Serif"/>
           <w:b/>
           <w:bCs/>
-        </w:rPr>
-        <w:t>2017</w:t>
+          <w:lang w:val="en-US"/>
+        </w:rPr>
+        <w:t>2018</w:t>
       </w:r>
     </w:p>
     <w:p>
@@ -1114,6 +1069,66 @@
       <w:r>
         <w:rPr>
           <w:rFonts w:ascii="Liberation Serif" w:hAnsi="Liberation Serif"/>
+          <w:lang w:val="en-US"/>
+        </w:rPr>
+        <w:t>van Sebille, E., et al. (2018), Lagrangian ocean analysis: Fundamentals and practices, Ocean Modelling, 121, 49</w:t>
+      </w:r>
+      <w:r>
+        <w:rPr>
+          <w:rFonts w:ascii="Liberation Serif" w:hAnsi="Liberation Serif"/>
+        </w:rPr>
+        <w:t xml:space="preserve">–75, 10.1016/j.ocemod.2017.11.008. </w:t>
+      </w:r>
+      <w:r>
+        <w:rPr>
+          <w:rFonts w:eastAsia="Times Roman" w:cs="Times Roman" w:ascii="Liberation Serif" w:hAnsi="Liberation Serif"/>
+        </w:rPr>
+        <w:br/>
+      </w:r>
+      <w:hyperlink r:id="rId15">
+        <w:r>
+          <w:rPr>
+            <w:rStyle w:val="Hyperlink"/>
+            <w:rFonts w:eastAsia="Times Roman" w:cs="Times Roman" w:ascii="Liberation Serif" w:hAnsi="Liberation Serif"/>
+          </w:rPr>
+          <w:t>[http link]</w:t>
+        </w:r>
+      </w:hyperlink>
+    </w:p>
+    <w:p>
+      <w:pPr>
+        <w:pStyle w:val="Default"/>
+        <w:bidi w:val="0"/>
+        <w:spacing w:lineRule="auto" w:line="240" w:before="120" w:after="0"/>
+        <w:ind w:hanging="0" w:start="0" w:end="0"/>
+        <w:jc w:val="start"/>
+        <w:rPr>
+          <w:rFonts w:ascii="Liberation Serif" w:hAnsi="Liberation Serif"/>
+          <w:b/>
+          <w:bCs/>
+        </w:rPr>
+      </w:pPr>
+      <w:r>
+        <w:rPr>
+          <w:rFonts w:ascii="Liberation Serif" w:hAnsi="Liberation Serif"/>
+          <w:b/>
+          <w:bCs/>
+        </w:rPr>
+        <w:t>2017</w:t>
+      </w:r>
+    </w:p>
+    <w:p>
+      <w:pPr>
+        <w:pStyle w:val="Default"/>
+        <w:bidi w:val="0"/>
+        <w:spacing w:lineRule="auto" w:line="240" w:before="120" w:after="0"/>
+        <w:ind w:hanging="0" w:start="720" w:end="0"/>
+        <w:jc w:val="start"/>
+        <w:rPr/>
+      </w:pPr>
+      <w:r>
+        <w:rPr>
+          <w:rFonts w:ascii="Liberation Serif" w:hAnsi="Liberation Serif"/>
         </w:rPr>
         <w:t>D</w:t>
       </w:r>
@@ -1221,7 +1236,7 @@
         </w:rPr>
         <w:br/>
       </w:r>
-      <w:hyperlink r:id="rId15">
+      <w:hyperlink r:id="rId16">
         <w:r>
           <w:rPr>
             <w:rStyle w:val="Hyperlink"/>
@@ -1269,7 +1284,7 @@
         </w:rPr>
         <w:br/>
       </w:r>
-      <w:hyperlink r:id="rId16">
+      <w:hyperlink r:id="rId17">
         <w:r>
           <w:rPr>
             <w:rStyle w:val="Hyperlink"/>
@@ -1364,7 +1379,7 @@
         </w:rPr>
         <w:br/>
       </w:r>
-      <w:hyperlink r:id="rId17">
+      <w:hyperlink r:id="rId18">
         <w:r>
           <w:rPr>
             <w:rStyle w:val="Hyperlink"/>
@@ -1519,7 +1534,7 @@
         </w:rPr>
         <w:br/>
       </w:r>
-      <w:hyperlink r:id="rId18">
+      <w:hyperlink r:id="rId19">
         <w:r>
           <w:rPr>
             <w:rStyle w:val="Hyperlink"/>
@@ -1653,7 +1668,7 @@
         </w:rPr>
         <w:br/>
       </w:r>
-      <w:hyperlink r:id="rId19">
+      <w:hyperlink r:id="rId20">
         <w:r>
           <w:rPr>
             <w:rStyle w:val="Hyperlink"/>
@@ -1700,7 +1715,7 @@
         </w:rPr>
         <w:br/>
       </w:r>
-      <w:hyperlink r:id="rId20">
+      <w:hyperlink r:id="rId21">
         <w:r>
           <w:rPr>
             <w:rStyle w:val="Hyperlink"/>
@@ -1810,7 +1825,7 @@
         <w:t xml:space="preserve">–928. </w:t>
         <w:br/>
       </w:r>
-      <w:hyperlink r:id="rId21">
+      <w:hyperlink r:id="rId22">
         <w:r>
           <w:rPr>
             <w:rStyle w:val="Hyperlink"/>
@@ -1906,7 +1921,7 @@
         </w:rPr>
         <w:br/>
       </w:r>
-      <w:hyperlink r:id="rId22">
+      <w:hyperlink r:id="rId23">
         <w:r>
           <w:rPr>
             <w:rStyle w:val="Hyperlink"/>
@@ -2002,7 +2017,7 @@
         </w:rPr>
         <w:br/>
       </w:r>
-      <w:hyperlink r:id="rId23">
+      <w:hyperlink r:id="rId24">
         <w:r>
           <w:rPr>
             <w:rStyle w:val="Hyperlink"/>
@@ -2086,7 +2101,7 @@
         </w:rPr>
         <w:br/>
       </w:r>
-      <w:hyperlink r:id="rId24">
+      <w:hyperlink r:id="rId25">
         <w:r>
           <w:rPr>
             <w:rStyle w:val="Hyperlink"/>
@@ -2139,7 +2154,7 @@
         </w:rPr>
         <w:br/>
       </w:r>
-      <w:hyperlink r:id="rId25">
+      <w:hyperlink r:id="rId26">
         <w:r>
           <w:rPr>
             <w:rStyle w:val="Hyperlink"/>
@@ -2226,7 +2241,7 @@
         <w:t xml:space="preserve"> (2014), Atmospheric &amp; Oceanic Applications of Eulerian and Lagrangian Transport Modelling, Ph.D. thesis, Stockholm University. URN: urn:nbn:se:su:diva-97348</w:t>
         <w:br/>
       </w:r>
-      <w:hyperlink r:id="rId26">
+      <w:hyperlink r:id="rId27">
         <w:r>
           <w:rPr>
             <w:rStyle w:val="Hyperlink"/>
@@ -2263,7 +2278,7 @@
         <w:t xml:space="preserve"> (2009), Lagrangian Decomposition of the Hadley Cells, Master thesis, Stockholm University. URN: urn:nbn:se:su:diva-8732</w:t>
         <w:br/>
       </w:r>
-      <w:hyperlink r:id="rId27">
+      <w:hyperlink r:id="rId28">
         <w:r>
           <w:rPr>
             <w:rStyle w:val="Hyperlink"/>
@@ -2320,55 +2335,6 @@
           <w:rFonts w:ascii="Liberation Serif" w:hAnsi="Liberation Serif"/>
         </w:rPr>
         <w:t xml:space="preserve"> (2021) OASIS Dedicated Support, 5th annual summer, Technical Report, TR/CMGC/21/150, CECI, UMR CERFACS/CNRS No 5318, France</w:t>
-        <w:br/>
-      </w:r>
-      <w:hyperlink r:id="rId28">
-        <w:r>
-          <w:rPr>
-            <w:rStyle w:val="Hyperlink"/>
-            <w:rFonts w:ascii="Liberation Serif" w:hAnsi="Liberation Serif"/>
-          </w:rPr>
-          <w:t>[http link]</w:t>
-        </w:r>
-      </w:hyperlink>
-    </w:p>
-    <w:p>
-      <w:pPr>
-        <w:pStyle w:val="Default"/>
-        <w:bidi w:val="0"/>
-        <w:spacing w:lineRule="auto" w:line="240" w:before="120" w:after="0"/>
-        <w:ind w:hanging="0" w:start="0" w:end="0"/>
-        <w:jc w:val="start"/>
-        <w:rPr/>
-      </w:pPr>
-      <w:r>
-        <w:rPr>
-          <w:rFonts w:ascii="Liberation Serif" w:hAnsi="Liberation Serif"/>
-          <w:lang w:val="en-US"/>
-        </w:rPr>
-        <w:t xml:space="preserve">Groeskamp, S., </w:t>
-      </w:r>
-      <w:r>
-        <w:rPr>
-          <w:rFonts w:ascii="Liberation Serif" w:hAnsi="Liberation Serif"/>
-          <w:b/>
-          <w:bCs/>
-          <w:lang w:val="en-US"/>
-        </w:rPr>
-        <w:t>Kjellsson, J.</w:t>
-      </w:r>
-      <w:r>
-        <w:rPr>
-          <w:rFonts w:ascii="Liberation Serif" w:hAnsi="Liberation Serif"/>
-          <w:lang w:val="en-US"/>
-        </w:rPr>
-        <w:t xml:space="preserve"> (2021) NEED Northern European Enclosure Dam, Europhysics News, 52 (2), doi: </w:t>
-      </w:r>
-      <w:r>
-        <w:rPr>
-          <w:rFonts w:ascii="Liberation Serif" w:hAnsi="Liberation Serif"/>
-        </w:rPr>
-        <w:t>10.1051/epn/2021201</w:t>
         <w:br/>
       </w:r>
       <w:hyperlink r:id="rId29">
@@ -2393,6 +2359,13 @@
       <w:r>
         <w:rPr>
           <w:rFonts w:ascii="Liberation Serif" w:hAnsi="Liberation Serif"/>
+          <w:lang w:val="en-US"/>
+        </w:rPr>
+        <w:t xml:space="preserve">Groeskamp, S., </w:t>
+      </w:r>
+      <w:r>
+        <w:rPr>
+          <w:rFonts w:ascii="Liberation Serif" w:hAnsi="Liberation Serif"/>
           <w:b/>
           <w:bCs/>
           <w:lang w:val="en-US"/>
@@ -2404,6 +2377,48 @@
           <w:rFonts w:ascii="Liberation Serif" w:hAnsi="Liberation Serif"/>
           <w:lang w:val="en-US"/>
         </w:rPr>
+        <w:t xml:space="preserve"> (2021) NEED Northern European Enclosure Dam, Europhysics News, 52 (2), doi: </w:t>
+      </w:r>
+      <w:r>
+        <w:rPr>
+          <w:rFonts w:ascii="Liberation Serif" w:hAnsi="Liberation Serif"/>
+        </w:rPr>
+        <w:t>10.1051/epn/2021201</w:t>
+        <w:br/>
+      </w:r>
+      <w:hyperlink r:id="rId30">
+        <w:r>
+          <w:rPr>
+            <w:rStyle w:val="Hyperlink"/>
+            <w:rFonts w:ascii="Liberation Serif" w:hAnsi="Liberation Serif"/>
+          </w:rPr>
+          <w:t>[http link]</w:t>
+        </w:r>
+      </w:hyperlink>
+    </w:p>
+    <w:p>
+      <w:pPr>
+        <w:pStyle w:val="Default"/>
+        <w:bidi w:val="0"/>
+        <w:spacing w:lineRule="auto" w:line="240" w:before="120" w:after="0"/>
+        <w:ind w:hanging="0" w:start="0" w:end="0"/>
+        <w:jc w:val="start"/>
+        <w:rPr/>
+      </w:pPr>
+      <w:r>
+        <w:rPr>
+          <w:rFonts w:ascii="Liberation Serif" w:hAnsi="Liberation Serif"/>
+          <w:b/>
+          <w:bCs/>
+          <w:lang w:val="en-US"/>
+        </w:rPr>
+        <w:t>Kjellsson, J.</w:t>
+      </w:r>
+      <w:r>
+        <w:rPr>
+          <w:rFonts w:ascii="Liberation Serif" w:hAnsi="Liberation Serif"/>
+          <w:lang w:val="en-US"/>
+        </w:rPr>
         <w:t xml:space="preserve">, Streffing, J., Carver, G., Koehler, M. (2020), From weather forecasting to climate modelling using OpenIFS, ECMWF Newsletter, 164, doi: </w:t>
       </w:r>
       <w:r>
@@ -2418,7 +2433,7 @@
         </w:rPr>
         <w:br/>
       </w:r>
-      <w:hyperlink r:id="rId30">
+      <w:hyperlink r:id="rId31">
         <w:r>
           <w:rPr>
             <w:rStyle w:val="Hyperlink"/>
@@ -2516,7 +2531,7 @@
         </w:rPr>
         <w:br/>
       </w:r>
-      <w:hyperlink r:id="rId31">
+      <w:hyperlink r:id="rId32">
         <w:r>
           <w:rPr>
             <w:rStyle w:val="Hyperlink"/>
@@ -2788,7 +2803,7 @@
           <w:rFonts w:eastAsia="Times Roman" w:cs="Times Roman" w:ascii="Liberation Serif" w:hAnsi="Liberation Serif"/>
           <w:lang w:val="en-US"/>
         </w:rPr>
-        <w:t xml:space="preserve">, Bidlot, J., Park, W. Impact of Wave coupling and Charnock capping on tropical sea surface temperature and circulation in a climate model. In prep. </w:t>
+        <w:t xml:space="preserve">, Bidlot, J., Park, W.  Impact of wave coupling and the Charnock parameter on tropical circulations in a climate model. Submitted to Climate Dynamics. </w:t>
       </w:r>
     </w:p>
     <w:p>
@@ -2823,7 +2838,7 @@
           <w:rFonts w:eastAsia="Times Roman" w:cs="Times Roman" w:ascii="Liberation Serif" w:hAnsi="Liberation Serif"/>
           <w:lang w:val="en-US"/>
         </w:rPr>
-        <w:t xml:space="preserve">, Savita, A., Nnamchi, H., Park, W. Contrasting Impacts of Atlantic and Pacific Decadal Variability on Regional Sahel Precipitation. In prep. </w:t>
+        <w:t xml:space="preserve">, Savita, A., Nnamchi, H., Park, W. Contrasting Impacts of Atlantic and Pacific Decadal Variability on Regional Sahel Precipitation. Submitted to Climate Dynamics. </w:t>
       </w:r>
     </w:p>
     <w:p>
@@ -2893,7 +2908,7 @@
           <w:rFonts w:ascii="Liberation Serif" w:hAnsi="Liberation Serif"/>
           <w:lang w:val="en-US"/>
         </w:rPr>
-        <w:t xml:space="preserve">, Martin, T., Chafik, L., Maisonnave, E., Park, W., (2025) Meridional heat transport in the North Atlantic region: Effects of ocean and atmosphere grid resolutions. In prep. </w:t>
+        <w:t xml:space="preserve">, Martin, T., Chafik, L., Maisonnave, E., Park, W., (2025) Meridional heat transport in the North Atlantic region: Effects of ocean and atmosphere grid resolutions. Submitted to Geosci. Mod. Dev. </w:t>
       </w:r>
     </w:p>
     <w:p>
@@ -2929,41 +2944,6 @@
           <w:lang w:val="en-US"/>
         </w:rPr>
         <w:t xml:space="preserve">, Latif, M., Wahl, S. North Atlantic Sea Surface Temperature-Driven Predictability of the North Atlantic Oscillation. In prep. </w:t>
-      </w:r>
-    </w:p>
-    <w:p>
-      <w:pPr>
-        <w:pStyle w:val="Default"/>
-        <w:bidi w:val="0"/>
-        <w:spacing w:lineRule="auto" w:line="240" w:before="120" w:after="0"/>
-        <w:ind w:hanging="0" w:start="0" w:end="0"/>
-        <w:jc w:val="start"/>
-        <w:rPr>
-          <w:rFonts w:ascii="Liberation Serif" w:hAnsi="Liberation Serif"/>
-        </w:rPr>
-      </w:pPr>
-      <w:r>
-        <w:rPr>
-          <w:rFonts w:ascii="Liberation Serif" w:hAnsi="Liberation Serif"/>
-          <w:lang w:val="en-US"/>
-        </w:rPr>
-        <w:t xml:space="preserve">StPierre, M., </w:t>
-      </w:r>
-      <w:r>
-        <w:rPr>
-          <w:rFonts w:ascii="Liberation Serif" w:hAnsi="Liberation Serif"/>
-          <w:b/>
-          <w:bCs/>
-          <w:lang w:val="en-US"/>
-        </w:rPr>
-        <w:t>Kjellsson, J.</w:t>
-      </w:r>
-      <w:r>
-        <w:rPr>
-          <w:rFonts w:ascii="Liberation Serif" w:hAnsi="Liberation Serif"/>
-          <w:lang w:val="en-US"/>
-        </w:rPr>
-        <w:t xml:space="preserve">, Park, W., Borchert, L.F., Latif, M., (2025) Emergence time of CO2-forced European summer climate trends. Accepted in Scientific Reports. </w:t>
       </w:r>
     </w:p>
     <w:p>
@@ -3006,7 +2986,7 @@
         </w:rPr>
         <w:br/>
       </w:r>
-      <w:hyperlink r:id="rId32">
+      <w:hyperlink r:id="rId33">
         <w:r>
           <w:rPr>
             <w:rStyle w:val="Hyperlink"/>
@@ -3017,13 +2997,52 @@
         </w:r>
       </w:hyperlink>
     </w:p>
+    <w:p>
+      <w:pPr>
+        <w:pStyle w:val="Default"/>
+        <w:bidi w:val="0"/>
+        <w:spacing w:lineRule="auto" w:line="240" w:before="120" w:after="0"/>
+        <w:ind w:hanging="0" w:start="0" w:end="0"/>
+        <w:jc w:val="start"/>
+        <w:rPr/>
+      </w:pPr>
+      <w:r>
+        <w:rPr>
+          <w:rStyle w:val="Hyperlink"/>
+          <w:rFonts w:ascii="Liberation Serif" w:hAnsi="Liberation Serif"/>
+          <w:u w:val="none"/>
+          <w:lang w:val="en-US"/>
+        </w:rPr>
+        <w:t xml:space="preserve">Zhang, Q., </w:t>
+      </w:r>
+      <w:r>
+        <w:rPr>
+          <w:rStyle w:val="Hyperlink"/>
+          <w:rFonts w:ascii="Liberation Serif" w:hAnsi="Liberation Serif"/>
+          <w:b/>
+          <w:bCs/>
+          <w:u w:val="none"/>
+          <w:lang w:val="en-US"/>
+        </w:rPr>
+        <w:t>Kjellsson, J.</w:t>
+      </w:r>
+      <w:r>
+        <w:rPr>
+          <w:rStyle w:val="Hyperlink"/>
+          <w:rFonts w:ascii="Liberation Serif" w:hAnsi="Liberation Serif"/>
+          <w:u w:val="none"/>
+          <w:lang w:val="en-US"/>
+        </w:rPr>
+        <w:t xml:space="preserve">, Black, E., Krüger, J. Trends in Heat Stress During Heat Waves Across Europe (1979-2023). In review for Geophys. Res. Lett. </w:t>
+      </w:r>
+    </w:p>
     <w:sectPr>
-      <w:headerReference w:type="even" r:id="rId33"/>
-      <w:headerReference w:type="default" r:id="rId34"/>
-      <w:headerReference w:type="first" r:id="rId35"/>
-      <w:footerReference w:type="even" r:id="rId36"/>
-      <w:footerReference w:type="default" r:id="rId37"/>
-      <w:footerReference w:type="first" r:id="rId38"/>
+      <w:headerReference w:type="even" r:id="rId34"/>
+      <w:headerReference w:type="default" r:id="rId35"/>
+      <w:headerReference w:type="first" r:id="rId36"/>
+      <w:footerReference w:type="even" r:id="rId37"/>
+      <w:footerReference w:type="default" r:id="rId38"/>
+      <w:footerReference w:type="first" r:id="rId39"/>
       <w:type w:val="nextPage"/>
       <w:pgSz w:w="11906" w:h="16838"/>
       <w:pgMar w:left="1134" w:right="1134" w:gutter="0" w:header="709" w:top="1134" w:footer="850" w:bottom="1134"/>
@@ -4331,6 +4350,29 @@
       <w14:textOutline>
         <w14:noFill/>
       </w14:textOutline>
+    </w:rPr>
+  </w:style>
+  <w:style w:type="paragraph" w:styleId="TableContents">
+    <w:name w:val="Table Contents"/>
+    <w:basedOn w:val="Normal"/>
+    <w:qFormat/>
+    <w:pPr>
+      <w:widowControl w:val="false"/>
+      <w:suppressLineNumbers/>
+    </w:pPr>
+    <w:rPr/>
+  </w:style>
+  <w:style w:type="paragraph" w:styleId="TableHeading">
+    <w:name w:val="Table Heading"/>
+    <w:basedOn w:val="TableContents"/>
+    <w:qFormat/>
+    <w:pPr>
+      <w:suppressLineNumbers/>
+      <w:jc w:val="center"/>
+    </w:pPr>
+    <w:rPr>
+      <w:b/>
+      <w:bCs/>
     </w:rPr>
   </w:style>
   <w:style w:type="numbering" w:styleId="NoList" w:default="1">

</xml_diff>